<commit_message>
[memmachine-research] Bước 2.1: Viết bảng đề xuất cải tiến (E1-E4)
- Thêm mục 8 (Bảng đề xuất cải tiến) với 4 đề xuất cụ thể:
  E1: Category tagging cho GOTCHAS.md
  E2: Threshold rule cho plan files cũ (.claude/plans/archive)
  E3: Handoff Log pruning khi vượt ngưỡng (> 7 entries)
  E4: Exponential backoff timing cho §9a Phase 3
- Thêm mục 9 (Trạng thái áp dụng) — chờ user xác nhận
- Xuất lại RESEARCH-memmachine-2026-07-19.docx

Plan: .claude/plans/PLAN-memmachine-research-2026-07-19.md
</commit_message>
<xml_diff>
--- a/docs/research/RESEARCH-memmachine-2026-07-19.docx
+++ b/docs/research/RESEARCH-memmachine-2026-07-19.docx
@@ -4066,7 +4066,1455 @@
           <w:color w:val="F05922"/>
           <w:sz w:val="28"/>
         </w:rPr>
-        <w:t>8. Trạng thái áp dụng đề xuất</w:t>
+        <w:t>8. Bảng đề xuất cải tiến</w:t>
+      </w:r>
+    </w:p>
+    <w:p>
+      <w:pPr>
+        <w:spacing w:before="40" w:after="40"/>
+        <w:ind w:left="567"/>
+        <w:pBdr>
+          <w:left w:val="single" w:sz="12" w:space="10" w:color="F05922"/>
+        </w:pBdr>
+      </w:pPr>
+      <w:r>
+        <w:rPr>
+          <w:color w:val="4A3F8C"/>
+        </w:rPr>
+        <w:t>Mỗi đề xuất rút ra từ pattern cụ thể trong MemMachine và đối chiếu với hiện trạng KZTEK. KHÔNG tự áp dụng — chờ user xác nhận ở Bước 2.2.</w:t>
+      </w:r>
+    </w:p>
+    <w:tbl>
+      <w:tblPr>
+        <w:tblStyle w:val="TableGrid"/>
+        <w:tblW w:type="auto" w:w="0"/>
+        <w:tblLook w:firstColumn="1" w:firstRow="1" w:lastColumn="0" w:lastRow="0" w:noHBand="0" w:noVBand="1" w:val="04A0"/>
+      </w:tblPr>
+      <w:tblGrid>
+        <w:gridCol w:w="1211"/>
+        <w:gridCol w:w="1211"/>
+        <w:gridCol w:w="1211"/>
+        <w:gridCol w:w="1211"/>
+        <w:gridCol w:w="1211"/>
+        <w:gridCol w:w="1211"/>
+        <w:gridCol w:w="1211"/>
+        <w:gridCol w:w="1211"/>
+      </w:tblGrid>
+      <w:tr>
+        <w:tc>
+          <w:tcPr>
+            <w:tcW w:type="dxa" w:w="1211"/>
+            <w:shd w:val="clear" w:color="auto" w:fill="251C53"/>
+            <w:tcBorders>
+              <w:top w:val="single" w:sz="4" w:space="0" w:color="251C53"/>
+              <w:left w:val="single" w:sz="4" w:space="0" w:color="251C53"/>
+              <w:bottom w:val="single" w:sz="4" w:space="0" w:color="251C53"/>
+              <w:right w:val="single" w:sz="4" w:space="0" w:color="251C53"/>
+            </w:tcBorders>
+          </w:tcPr>
+          <w:p>
+            <w:r>
+              <w:rPr>
+                <w:b/>
+                <w:color w:val="FFFFFF"/>
+                <w:sz w:val="20"/>
+              </w:rPr>
+              <w:t>#</w:t>
+            </w:r>
+          </w:p>
+        </w:tc>
+        <w:tc>
+          <w:tcPr>
+            <w:tcW w:type="dxa" w:w="1211"/>
+            <w:shd w:val="clear" w:color="auto" w:fill="251C53"/>
+            <w:tcBorders>
+              <w:top w:val="single" w:sz="4" w:space="0" w:color="251C53"/>
+              <w:left w:val="single" w:sz="4" w:space="0" w:color="251C53"/>
+              <w:bottom w:val="single" w:sz="4" w:space="0" w:color="251C53"/>
+              <w:right w:val="single" w:sz="4" w:space="0" w:color="251C53"/>
+            </w:tcBorders>
+          </w:tcPr>
+          <w:p>
+            <w:r>
+              <w:rPr>
+                <w:b/>
+                <w:color w:val="FFFFFF"/>
+                <w:sz w:val="20"/>
+              </w:rPr>
+              <w:t>Đề xuất</w:t>
+            </w:r>
+          </w:p>
+        </w:tc>
+        <w:tc>
+          <w:tcPr>
+            <w:tcW w:type="dxa" w:w="1211"/>
+            <w:shd w:val="clear" w:color="auto" w:fill="251C53"/>
+            <w:tcBorders>
+              <w:top w:val="single" w:sz="4" w:space="0" w:color="251C53"/>
+              <w:left w:val="single" w:sz="4" w:space="0" w:color="251C53"/>
+              <w:bottom w:val="single" w:sz="4" w:space="0" w:color="251C53"/>
+              <w:right w:val="single" w:sz="4" w:space="0" w:color="251C53"/>
+            </w:tcBorders>
+          </w:tcPr>
+          <w:p>
+            <w:r>
+              <w:rPr>
+                <w:b/>
+                <w:color w:val="FFFFFF"/>
+                <w:sz w:val="20"/>
+              </w:rPr>
+              <w:t>Hiện trạng KZTEK (đang có gì / chưa có gì)</w:t>
+            </w:r>
+          </w:p>
+        </w:tc>
+        <w:tc>
+          <w:tcPr>
+            <w:tcW w:type="dxa" w:w="1211"/>
+            <w:shd w:val="clear" w:color="auto" w:fill="251C53"/>
+            <w:tcBorders>
+              <w:top w:val="single" w:sz="4" w:space="0" w:color="251C53"/>
+              <w:left w:val="single" w:sz="4" w:space="0" w:color="251C53"/>
+              <w:bottom w:val="single" w:sz="4" w:space="0" w:color="251C53"/>
+              <w:right w:val="single" w:sz="4" w:space="0" w:color="251C53"/>
+            </w:tcBorders>
+          </w:tcPr>
+          <w:p>
+            <w:r>
+              <w:rPr>
+                <w:b/>
+                <w:color w:val="FFFFFF"/>
+                <w:sz w:val="20"/>
+              </w:rPr>
+              <w:t>Học từ đâu (file/pattern cụ thể trong repo nguồn)</w:t>
+            </w:r>
+          </w:p>
+        </w:tc>
+        <w:tc>
+          <w:tcPr>
+            <w:tcW w:type="dxa" w:w="1211"/>
+            <w:shd w:val="clear" w:color="auto" w:fill="251C53"/>
+            <w:tcBorders>
+              <w:top w:val="single" w:sz="4" w:space="0" w:color="251C53"/>
+              <w:left w:val="single" w:sz="4" w:space="0" w:color="251C53"/>
+              <w:bottom w:val="single" w:sz="4" w:space="0" w:color="251C53"/>
+              <w:right w:val="single" w:sz="4" w:space="0" w:color="251C53"/>
+            </w:tcBorders>
+          </w:tcPr>
+          <w:p>
+            <w:r>
+              <w:rPr>
+                <w:b/>
+                <w:color w:val="FFFFFF"/>
+                <w:sz w:val="20"/>
+              </w:rPr>
+              <w:t>Lý do thay đổi (vấn đề/khoảng trống cụ thể ở hiện trạng)</w:t>
+            </w:r>
+          </w:p>
+        </w:tc>
+        <w:tc>
+          <w:tcPr>
+            <w:tcW w:type="dxa" w:w="1211"/>
+            <w:shd w:val="clear" w:color="auto" w:fill="251C53"/>
+            <w:tcBorders>
+              <w:top w:val="single" w:sz="4" w:space="0" w:color="251C53"/>
+              <w:left w:val="single" w:sz="4" w:space="0" w:color="251C53"/>
+              <w:bottom w:val="single" w:sz="4" w:space="0" w:color="251C53"/>
+              <w:right w:val="single" w:sz="4" w:space="0" w:color="251C53"/>
+            </w:tcBorders>
+          </w:tcPr>
+          <w:p>
+            <w:r>
+              <w:rPr>
+                <w:b/>
+                <w:color w:val="FFFFFF"/>
+                <w:sz w:val="20"/>
+              </w:rPr>
+              <w:t>Áp dụng vào đâu trong KZTEK (file/agent/skill cụ thể)</w:t>
+            </w:r>
+          </w:p>
+        </w:tc>
+        <w:tc>
+          <w:tcPr>
+            <w:tcW w:type="dxa" w:w="1211"/>
+            <w:shd w:val="clear" w:color="auto" w:fill="251C53"/>
+            <w:tcBorders>
+              <w:top w:val="single" w:sz="4" w:space="0" w:color="251C53"/>
+              <w:left w:val="single" w:sz="4" w:space="0" w:color="251C53"/>
+              <w:bottom w:val="single" w:sz="4" w:space="0" w:color="251C53"/>
+              <w:right w:val="single" w:sz="4" w:space="0" w:color="251C53"/>
+            </w:tcBorders>
+          </w:tcPr>
+          <w:p>
+            <w:r>
+              <w:rPr>
+                <w:b/>
+                <w:color w:val="FFFFFF"/>
+                <w:sz w:val="20"/>
+              </w:rPr>
+              <w:t>Đạt được gì (kết quả cụ thể, quan sát/đo được)</w:t>
+            </w:r>
+          </w:p>
+        </w:tc>
+        <w:tc>
+          <w:tcPr>
+            <w:tcW w:type="dxa" w:w="1211"/>
+            <w:shd w:val="clear" w:color="auto" w:fill="251C53"/>
+            <w:tcBorders>
+              <w:top w:val="single" w:sz="4" w:space="0" w:color="251C53"/>
+              <w:left w:val="single" w:sz="4" w:space="0" w:color="251C53"/>
+              <w:bottom w:val="single" w:sz="4" w:space="0" w:color="251C53"/>
+              <w:right w:val="single" w:sz="4" w:space="0" w:color="251C53"/>
+            </w:tcBorders>
+          </w:tcPr>
+          <w:p>
+            <w:r>
+              <w:rPr>
+                <w:b/>
+                <w:color w:val="FFFFFF"/>
+                <w:sz w:val="20"/>
+              </w:rPr>
+              <w:t>Rủi ro/Effort</w:t>
+            </w:r>
+          </w:p>
+        </w:tc>
+      </w:tr>
+      <w:tr>
+        <w:tc>
+          <w:tcPr>
+            <w:tcW w:type="dxa" w:w="1211"/>
+            <w:tcBorders>
+              <w:top w:val="single" w:sz="4" w:space="0" w:color="CBCBCB"/>
+              <w:left w:val="single" w:sz="4" w:space="0" w:color="CBCBCB"/>
+              <w:bottom w:val="single" w:sz="4" w:space="0" w:color="CBCBCB"/>
+              <w:right w:val="single" w:sz="4" w:space="0" w:color="CBCBCB"/>
+            </w:tcBorders>
+          </w:tcPr>
+          <w:p>
+            <w:r>
+              <w:rPr>
+                <w:sz w:val="20"/>
+              </w:rPr>
+              <w:t>---</w:t>
+            </w:r>
+          </w:p>
+        </w:tc>
+        <w:tc>
+          <w:tcPr>
+            <w:tcW w:type="dxa" w:w="1211"/>
+            <w:tcBorders>
+              <w:top w:val="single" w:sz="4" w:space="0" w:color="CBCBCB"/>
+              <w:left w:val="single" w:sz="4" w:space="0" w:color="CBCBCB"/>
+              <w:bottom w:val="single" w:sz="4" w:space="0" w:color="CBCBCB"/>
+              <w:right w:val="single" w:sz="4" w:space="0" w:color="CBCBCB"/>
+            </w:tcBorders>
+          </w:tcPr>
+          <w:p>
+            <w:r>
+              <w:rPr>
+                <w:sz w:val="20"/>
+              </w:rPr>
+              <w:t>---------</w:t>
+            </w:r>
+          </w:p>
+        </w:tc>
+        <w:tc>
+          <w:tcPr>
+            <w:tcW w:type="dxa" w:w="1211"/>
+            <w:tcBorders>
+              <w:top w:val="single" w:sz="4" w:space="0" w:color="CBCBCB"/>
+              <w:left w:val="single" w:sz="4" w:space="0" w:color="CBCBCB"/>
+              <w:bottom w:val="single" w:sz="4" w:space="0" w:color="CBCBCB"/>
+              <w:right w:val="single" w:sz="4" w:space="0" w:color="CBCBCB"/>
+            </w:tcBorders>
+          </w:tcPr>
+          <w:p>
+            <w:r>
+              <w:rPr>
+                <w:sz w:val="20"/>
+              </w:rPr>
+              <w:t>------</w:t>
+            </w:r>
+          </w:p>
+        </w:tc>
+        <w:tc>
+          <w:tcPr>
+            <w:tcW w:type="dxa" w:w="1211"/>
+            <w:tcBorders>
+              <w:top w:val="single" w:sz="4" w:space="0" w:color="CBCBCB"/>
+              <w:left w:val="single" w:sz="4" w:space="0" w:color="CBCBCB"/>
+              <w:bottom w:val="single" w:sz="4" w:space="0" w:color="CBCBCB"/>
+              <w:right w:val="single" w:sz="4" w:space="0" w:color="CBCBCB"/>
+            </w:tcBorders>
+          </w:tcPr>
+          <w:p>
+            <w:r>
+              <w:rPr>
+                <w:sz w:val="20"/>
+              </w:rPr>
+              <w:t>------</w:t>
+            </w:r>
+          </w:p>
+        </w:tc>
+        <w:tc>
+          <w:tcPr>
+            <w:tcW w:type="dxa" w:w="1211"/>
+            <w:tcBorders>
+              <w:top w:val="single" w:sz="4" w:space="0" w:color="CBCBCB"/>
+              <w:left w:val="single" w:sz="4" w:space="0" w:color="CBCBCB"/>
+              <w:bottom w:val="single" w:sz="4" w:space="0" w:color="CBCBCB"/>
+              <w:right w:val="single" w:sz="4" w:space="0" w:color="CBCBCB"/>
+            </w:tcBorders>
+          </w:tcPr>
+          <w:p>
+            <w:r>
+              <w:rPr>
+                <w:sz w:val="20"/>
+              </w:rPr>
+              <w:t>------</w:t>
+            </w:r>
+          </w:p>
+        </w:tc>
+        <w:tc>
+          <w:tcPr>
+            <w:tcW w:type="dxa" w:w="1211"/>
+            <w:tcBorders>
+              <w:top w:val="single" w:sz="4" w:space="0" w:color="CBCBCB"/>
+              <w:left w:val="single" w:sz="4" w:space="0" w:color="CBCBCB"/>
+              <w:bottom w:val="single" w:sz="4" w:space="0" w:color="CBCBCB"/>
+              <w:right w:val="single" w:sz="4" w:space="0" w:color="CBCBCB"/>
+            </w:tcBorders>
+          </w:tcPr>
+          <w:p>
+            <w:r>
+              <w:rPr>
+                <w:sz w:val="20"/>
+              </w:rPr>
+              <w:t>------</w:t>
+            </w:r>
+          </w:p>
+        </w:tc>
+        <w:tc>
+          <w:tcPr>
+            <w:tcW w:type="dxa" w:w="1211"/>
+            <w:tcBorders>
+              <w:top w:val="single" w:sz="4" w:space="0" w:color="CBCBCB"/>
+              <w:left w:val="single" w:sz="4" w:space="0" w:color="CBCBCB"/>
+              <w:bottom w:val="single" w:sz="4" w:space="0" w:color="CBCBCB"/>
+              <w:right w:val="single" w:sz="4" w:space="0" w:color="CBCBCB"/>
+            </w:tcBorders>
+          </w:tcPr>
+          <w:p>
+            <w:r>
+              <w:rPr>
+                <w:sz w:val="20"/>
+              </w:rPr>
+              <w:t>------</w:t>
+            </w:r>
+          </w:p>
+        </w:tc>
+        <w:tc>
+          <w:tcPr>
+            <w:tcW w:type="dxa" w:w="1211"/>
+            <w:tcBorders>
+              <w:top w:val="single" w:sz="4" w:space="0" w:color="CBCBCB"/>
+              <w:left w:val="single" w:sz="4" w:space="0" w:color="CBCBCB"/>
+              <w:bottom w:val="single" w:sz="4" w:space="0" w:color="CBCBCB"/>
+              <w:right w:val="single" w:sz="4" w:space="0" w:color="CBCBCB"/>
+            </w:tcBorders>
+          </w:tcPr>
+          <w:p>
+            <w:r>
+              <w:rPr>
+                <w:sz w:val="20"/>
+              </w:rPr>
+              <w:t>------</w:t>
+            </w:r>
+          </w:p>
+        </w:tc>
+      </w:tr>
+      <w:tr>
+        <w:tc>
+          <w:tcPr>
+            <w:tcW w:type="dxa" w:w="1211"/>
+            <w:shd w:val="clear" w:color="auto" w:fill="B8B3D6"/>
+            <w:tcBorders>
+              <w:top w:val="single" w:sz="4" w:space="0" w:color="CBCBCB"/>
+              <w:left w:val="single" w:sz="4" w:space="0" w:color="CBCBCB"/>
+              <w:bottom w:val="single" w:sz="4" w:space="0" w:color="CBCBCB"/>
+              <w:right w:val="single" w:sz="4" w:space="0" w:color="CBCBCB"/>
+            </w:tcBorders>
+          </w:tcPr>
+          <w:p>
+            <w:r>
+              <w:rPr>
+                <w:sz w:val="20"/>
+              </w:rPr>
+              <w:t>E1</w:t>
+            </w:r>
+          </w:p>
+        </w:tc>
+        <w:tc>
+          <w:tcPr>
+            <w:tcW w:type="dxa" w:w="1211"/>
+            <w:shd w:val="clear" w:color="auto" w:fill="B8B3D6"/>
+            <w:tcBorders>
+              <w:top w:val="single" w:sz="4" w:space="0" w:color="CBCBCB"/>
+              <w:left w:val="single" w:sz="4" w:space="0" w:color="CBCBCB"/>
+              <w:bottom w:val="single" w:sz="4" w:space="0" w:color="CBCBCB"/>
+              <w:right w:val="single" w:sz="4" w:space="0" w:color="CBCBCB"/>
+            </w:tcBorders>
+          </w:tcPr>
+          <w:p>
+            <w:r>
+              <w:rPr>
+                <w:b/>
+                <w:sz w:val="20"/>
+              </w:rPr>
+              <w:t>Category tagging cho GOTCHAS.md</w:t>
+            </w:r>
+            <w:r>
+              <w:rPr>
+                <w:sz w:val="20"/>
+              </w:rPr>
+              <w:t xml:space="preserve"> — thêm thẻ category vào mỗi entry và bảng lọc nhanh theo loại lỗi ở đầu file</w:t>
+            </w:r>
+          </w:p>
+        </w:tc>
+        <w:tc>
+          <w:tcPr>
+            <w:tcW w:type="dxa" w:w="1211"/>
+            <w:shd w:val="clear" w:color="auto" w:fill="B8B3D6"/>
+            <w:tcBorders>
+              <w:top w:val="single" w:sz="4" w:space="0" w:color="CBCBCB"/>
+              <w:left w:val="single" w:sz="4" w:space="0" w:color="CBCBCB"/>
+              <w:bottom w:val="single" w:sz="4" w:space="0" w:color="CBCBCB"/>
+              <w:right w:val="single" w:sz="4" w:space="0" w:color="CBCBCB"/>
+            </w:tcBorders>
+          </w:tcPr>
+          <w:p>
+            <w:r>
+              <w:rPr>
+                <w:sz w:val="20"/>
+              </w:rPr>
+              <w:t>GOTCHAS.md hiện có mục lục phẳng (G001, G002...) không phân loại theo domain — chỉ có số thứ tự và tên vấn đề ngắn. Khi số entry tăng, agent phải đọc tuần tự để tìm entry liên quan đến loại lỗi cụ thể</w:t>
+            </w:r>
+          </w:p>
+        </w:tc>
+        <w:tc>
+          <w:tcPr>
+            <w:tcW w:type="dxa" w:w="1211"/>
+            <w:shd w:val="clear" w:color="auto" w:fill="B8B3D6"/>
+            <w:tcBorders>
+              <w:top w:val="single" w:sz="4" w:space="0" w:color="CBCBCB"/>
+              <w:left w:val="single" w:sz="4" w:space="0" w:color="CBCBCB"/>
+              <w:bottom w:val="single" w:sz="4" w:space="0" w:color="CBCBCB"/>
+              <w:right w:val="single" w:sz="4" w:space="0" w:color="CBCBCB"/>
+            </w:tcBorders>
+          </w:tcPr>
+          <w:p>
+            <w:r>
+              <w:rPr>
+                <w:rFonts w:ascii="Courier New" w:hAnsi="Courier New"/>
+                <w:color w:val="F05922"/>
+                <w:sz w:val="20"/>
+              </w:rPr>
+              <w:t>packages/server/src/memmachine_server/semantic_memory/config_store/</w:t>
+            </w:r>
+            <w:r>
+              <w:rPr>
+                <w:sz w:val="20"/>
+              </w:rPr>
+              <w:t xml:space="preserve"> — mỗi set_id có danh sách category (VD: "travel preferences", "dietary restrictions") với </w:t>
+            </w:r>
+            <w:r>
+              <w:rPr>
+                <w:rFonts w:ascii="Courier New" w:hAnsi="Courier New"/>
+                <w:color w:val="F05922"/>
+                <w:sz w:val="20"/>
+              </w:rPr>
+              <w:t>prompt</w:t>
+            </w:r>
+            <w:r>
+              <w:rPr>
+                <w:sz w:val="20"/>
+              </w:rPr>
+              <w:t xml:space="preserve"> hướng dẫn trích xuất thông tin đúng loại. Pattern: phân loại trước → tìm kiếm theo category thay vì scan toàn bộ</w:t>
+            </w:r>
+          </w:p>
+        </w:tc>
+        <w:tc>
+          <w:tcPr>
+            <w:tcW w:type="dxa" w:w="1211"/>
+            <w:shd w:val="clear" w:color="auto" w:fill="B8B3D6"/>
+            <w:tcBorders>
+              <w:top w:val="single" w:sz="4" w:space="0" w:color="CBCBCB"/>
+              <w:left w:val="single" w:sz="4" w:space="0" w:color="CBCBCB"/>
+              <w:bottom w:val="single" w:sz="4" w:space="0" w:color="CBCBCB"/>
+              <w:right w:val="single" w:sz="4" w:space="0" w:color="CBCBCB"/>
+            </w:tcBorders>
+          </w:tcPr>
+          <w:p>
+            <w:r>
+              <w:rPr>
+                <w:sz w:val="20"/>
+              </w:rPr>
+              <w:t>GOTCHAS.md với 1 entry duy nhất (G001) hiện không cần phân loại. Nhưng khi có 10+ entries, Dispatcher phải đọc toàn bộ file để tìm, ví dụ, "tất cả lỗi script". Hiện không có cách lọc theo loại lỗi mà không đọc hết</w:t>
+            </w:r>
+          </w:p>
+        </w:tc>
+        <w:tc>
+          <w:tcPr>
+            <w:tcW w:type="dxa" w:w="1211"/>
+            <w:shd w:val="clear" w:color="auto" w:fill="B8B3D6"/>
+            <w:tcBorders>
+              <w:top w:val="single" w:sz="4" w:space="0" w:color="CBCBCB"/>
+              <w:left w:val="single" w:sz="4" w:space="0" w:color="CBCBCB"/>
+              <w:bottom w:val="single" w:sz="4" w:space="0" w:color="CBCBCB"/>
+              <w:right w:val="single" w:sz="4" w:space="0" w:color="CBCBCB"/>
+            </w:tcBorders>
+          </w:tcPr>
+          <w:p>
+            <w:r>
+              <w:rPr>
+                <w:rFonts w:ascii="Courier New" w:hAnsi="Courier New"/>
+                <w:color w:val="F05922"/>
+                <w:sz w:val="20"/>
+              </w:rPr>
+              <w:t>.claude/GOTCHAS.md</w:t>
+            </w:r>
+            <w:r>
+              <w:rPr>
+                <w:sz w:val="20"/>
+              </w:rPr>
+              <w:t xml:space="preserve"> — thêm (a) bảng lọc nhanh ở đầu file với cột "Category" (</w:t>
+            </w:r>
+            <w:r>
+              <w:rPr>
+                <w:rFonts w:ascii="Courier New" w:hAnsi="Courier New"/>
+                <w:color w:val="F05922"/>
+                <w:sz w:val="20"/>
+              </w:rPr>
+              <w:t>[SCRIPT]</w:t>
+            </w:r>
+            <w:r>
+              <w:rPr>
+                <w:sz w:val="20"/>
+              </w:rPr>
+              <w:t xml:space="preserve">, </w:t>
+            </w:r>
+            <w:r>
+              <w:rPr>
+                <w:rFonts w:ascii="Courier New" w:hAnsi="Courier New"/>
+                <w:color w:val="F05922"/>
+                <w:sz w:val="20"/>
+              </w:rPr>
+              <w:t>[GIT]</w:t>
+            </w:r>
+            <w:r>
+              <w:rPr>
+                <w:sz w:val="20"/>
+              </w:rPr>
+              <w:t xml:space="preserve">, </w:t>
+            </w:r>
+            <w:r>
+              <w:rPr>
+                <w:rFonts w:ascii="Courier New" w:hAnsi="Courier New"/>
+                <w:color w:val="F05922"/>
+                <w:sz w:val="20"/>
+              </w:rPr>
+              <w:t>[AGENT-LOOP]</w:t>
+            </w:r>
+            <w:r>
+              <w:rPr>
+                <w:sz w:val="20"/>
+              </w:rPr>
+              <w:t xml:space="preserve">, </w:t>
+            </w:r>
+            <w:r>
+              <w:rPr>
+                <w:rFonts w:ascii="Courier New" w:hAnsi="Courier New"/>
+                <w:color w:val="F05922"/>
+                <w:sz w:val="20"/>
+              </w:rPr>
+              <w:t>[CONFIG]</w:t>
+            </w:r>
+            <w:r>
+              <w:rPr>
+                <w:sz w:val="20"/>
+              </w:rPr>
+              <w:t xml:space="preserve">, </w:t>
+            </w:r>
+            <w:r>
+              <w:rPr>
+                <w:rFonts w:ascii="Courier New" w:hAnsi="Courier New"/>
+                <w:color w:val="F05922"/>
+                <w:sz w:val="20"/>
+              </w:rPr>
+              <w:t>[NETWORK]</w:t>
+            </w:r>
+            <w:r>
+              <w:rPr>
+                <w:sz w:val="20"/>
+              </w:rPr>
+              <w:t xml:space="preserve">), và (b) thêm dòng </w:t>
+            </w:r>
+            <w:r>
+              <w:rPr>
+                <w:rFonts w:ascii="Courier New" w:hAnsi="Courier New"/>
+                <w:color w:val="F05922"/>
+                <w:sz w:val="20"/>
+              </w:rPr>
+              <w:t>Category:</w:t>
+            </w:r>
+            <w:r>
+              <w:rPr>
+                <w:sz w:val="20"/>
+              </w:rPr>
+              <w:t xml:space="preserve"> vào header của mỗi entry mới. Template entry ở comment cuối file cũng cập nhật</w:t>
+            </w:r>
+          </w:p>
+        </w:tc>
+        <w:tc>
+          <w:tcPr>
+            <w:tcW w:type="dxa" w:w="1211"/>
+            <w:shd w:val="clear" w:color="auto" w:fill="B8B3D6"/>
+            <w:tcBorders>
+              <w:top w:val="single" w:sz="4" w:space="0" w:color="CBCBCB"/>
+              <w:left w:val="single" w:sz="4" w:space="0" w:color="CBCBCB"/>
+              <w:bottom w:val="single" w:sz="4" w:space="0" w:color="CBCBCB"/>
+              <w:right w:val="single" w:sz="4" w:space="0" w:color="CBCBCB"/>
+            </w:tcBorders>
+          </w:tcPr>
+          <w:p>
+            <w:r>
+              <w:rPr>
+                <w:sz w:val="20"/>
+              </w:rPr>
+              <w:t xml:space="preserve">Khi agent gặp </w:t>
+            </w:r>
+            <w:r>
+              <w:rPr>
+                <w:rFonts w:ascii="Courier New" w:hAnsi="Courier New"/>
+                <w:color w:val="F05922"/>
+                <w:sz w:val="20"/>
+              </w:rPr>
+              <w:t>ModuleNotFoundError</w:t>
+            </w:r>
+            <w:r>
+              <w:rPr>
+                <w:sz w:val="20"/>
+              </w:rPr>
+              <w:t xml:space="preserve">, tra GOTCHAS.md theo category </w:t>
+            </w:r>
+            <w:r>
+              <w:rPr>
+                <w:rFonts w:ascii="Courier New" w:hAnsi="Courier New"/>
+                <w:color w:val="F05922"/>
+                <w:sz w:val="20"/>
+              </w:rPr>
+              <w:t>[SCRIPT]</w:t>
+            </w:r>
+            <w:r>
+              <w:rPr>
+                <w:sz w:val="20"/>
+              </w:rPr>
+              <w:t xml:space="preserve"> thay vì đọc tất cả entries — tìm đúng entry trong 1 bước thay vì scan N entries. Với 10+ entries, giảm số dòng cần đọc từ ~100% xuống ~30% (chỉ đọc đúng category)</w:t>
+            </w:r>
+          </w:p>
+        </w:tc>
+        <w:tc>
+          <w:tcPr>
+            <w:tcW w:type="dxa" w:w="1211"/>
+            <w:shd w:val="clear" w:color="auto" w:fill="B8B3D6"/>
+            <w:tcBorders>
+              <w:top w:val="single" w:sz="4" w:space="0" w:color="CBCBCB"/>
+              <w:left w:val="single" w:sz="4" w:space="0" w:color="CBCBCB"/>
+              <w:bottom w:val="single" w:sz="4" w:space="0" w:color="CBCBCB"/>
+              <w:right w:val="single" w:sz="4" w:space="0" w:color="CBCBCB"/>
+            </w:tcBorders>
+          </w:tcPr>
+          <w:p>
+            <w:r>
+              <w:rPr>
+                <w:sz w:val="20"/>
+              </w:rPr>
+              <w:t>Rủi ro: thấp — chỉ thêm metadata vào file text, không đổi logic. Effort: thấp — sửa template comment + bảng lọc ở GOTCHAS.md, 1 file duy nhất</w:t>
+            </w:r>
+          </w:p>
+        </w:tc>
+      </w:tr>
+      <w:tr>
+        <w:tc>
+          <w:tcPr>
+            <w:tcW w:type="dxa" w:w="1211"/>
+            <w:tcBorders>
+              <w:top w:val="single" w:sz="4" w:space="0" w:color="CBCBCB"/>
+              <w:left w:val="single" w:sz="4" w:space="0" w:color="CBCBCB"/>
+              <w:bottom w:val="single" w:sz="4" w:space="0" w:color="CBCBCB"/>
+              <w:right w:val="single" w:sz="4" w:space="0" w:color="CBCBCB"/>
+            </w:tcBorders>
+          </w:tcPr>
+          <w:p>
+            <w:r>
+              <w:rPr>
+                <w:sz w:val="20"/>
+              </w:rPr>
+              <w:t>E2</w:t>
+            </w:r>
+          </w:p>
+        </w:tc>
+        <w:tc>
+          <w:tcPr>
+            <w:tcW w:type="dxa" w:w="1211"/>
+            <w:tcBorders>
+              <w:top w:val="single" w:sz="4" w:space="0" w:color="CBCBCB"/>
+              <w:left w:val="single" w:sz="4" w:space="0" w:color="CBCBCB"/>
+              <w:bottom w:val="single" w:sz="4" w:space="0" w:color="CBCBCB"/>
+              <w:right w:val="single" w:sz="4" w:space="0" w:color="CBCBCB"/>
+            </w:tcBorders>
+          </w:tcPr>
+          <w:p>
+            <w:r>
+              <w:rPr>
+                <w:b/>
+                <w:sz w:val="20"/>
+              </w:rPr>
+              <w:t>Threshold rule cho plan files cũ</w:t>
+            </w:r>
+            <w:r>
+              <w:rPr>
+                <w:sz w:val="20"/>
+              </w:rPr>
+              <w:t xml:space="preserve"> — định nghĩa ngưỡng archive tự động cho </w:t>
+            </w:r>
+            <w:r>
+              <w:rPr>
+                <w:rFonts w:ascii="Courier New" w:hAnsi="Courier New"/>
+                <w:color w:val="F05922"/>
+                <w:sz w:val="20"/>
+              </w:rPr>
+              <w:t>.claude/plans/PLAN-*.md</w:t>
+            </w:r>
+            <w:r>
+              <w:rPr>
+                <w:sz w:val="20"/>
+              </w:rPr>
+              <w:t xml:space="preserve"> đã hoàn thành</w:t>
+            </w:r>
+          </w:p>
+        </w:tc>
+        <w:tc>
+          <w:tcPr>
+            <w:tcW w:type="dxa" w:w="1211"/>
+            <w:tcBorders>
+              <w:top w:val="single" w:sz="4" w:space="0" w:color="CBCBCB"/>
+              <w:left w:val="single" w:sz="4" w:space="0" w:color="CBCBCB"/>
+              <w:bottom w:val="single" w:sz="4" w:space="0" w:color="CBCBCB"/>
+              <w:right w:val="single" w:sz="4" w:space="0" w:color="CBCBCB"/>
+            </w:tcBorders>
+          </w:tcPr>
+          <w:p>
+            <w:r>
+              <w:rPr>
+                <w:rFonts w:ascii="Courier New" w:hAnsi="Courier New"/>
+                <w:color w:val="F05922"/>
+                <w:sz w:val="20"/>
+              </w:rPr>
+              <w:t>.claude/plans/</w:t>
+            </w:r>
+            <w:r>
+              <w:rPr>
+                <w:sz w:val="20"/>
+              </w:rPr>
+              <w:t xml:space="preserve"> không có chính sách cleanup. Các PLAN-*.md status=done/completed tích lũy vô thời hạn. Hiện có khoảng 2-3 plan files (ít vì workspace còn mới); chưa gây vấn đề. Không có rule nào trong CLAUDE.md hay task-planner về archiving</w:t>
+            </w:r>
+          </w:p>
+        </w:tc>
+        <w:tc>
+          <w:tcPr>
+            <w:tcW w:type="dxa" w:w="1211"/>
+            <w:tcBorders>
+              <w:top w:val="single" w:sz="4" w:space="0" w:color="CBCBCB"/>
+              <w:left w:val="single" w:sz="4" w:space="0" w:color="CBCBCB"/>
+              <w:bottom w:val="single" w:sz="4" w:space="0" w:color="CBCBCB"/>
+              <w:right w:val="single" w:sz="4" w:space="0" w:color="CBCBCB"/>
+            </w:tcBorders>
+          </w:tcPr>
+          <w:p>
+            <w:r>
+              <w:rPr>
+                <w:rFonts w:ascii="Courier New" w:hAnsi="Courier New"/>
+                <w:color w:val="F05922"/>
+                <w:sz w:val="20"/>
+              </w:rPr>
+              <w:t>packages/server/src/memmachine_server/semantic_memory/semantic_ingestion.py</w:t>
+            </w:r>
+            <w:r>
+              <w:rPr>
+                <w:sz w:val="20"/>
+              </w:rPr>
+              <w:t xml:space="preserve">, hàm </w:t>
+            </w:r>
+            <w:r>
+              <w:rPr>
+                <w:rFonts w:ascii="Courier New" w:hAnsi="Courier New"/>
+                <w:color w:val="F05922"/>
+                <w:sz w:val="20"/>
+              </w:rPr>
+              <w:t>_consolidate_features()</w:t>
+            </w:r>
+            <w:r>
+              <w:rPr>
+                <w:sz w:val="20"/>
+              </w:rPr>
+              <w:t xml:space="preserve"> — khi </w:t>
+            </w:r>
+            <w:r>
+              <w:rPr>
+                <w:rFonts w:ascii="Courier New" w:hAnsi="Courier New"/>
+                <w:color w:val="F05922"/>
+                <w:sz w:val="20"/>
+              </w:rPr>
+              <w:t>feature_count &gt; threshold (20)</w:t>
+            </w:r>
+            <w:r>
+              <w:rPr>
+                <w:sz w:val="20"/>
+              </w:rPr>
+              <w:t xml:space="preserve"> → gọi LLM consolidation gộp/xoá entries thừa. Pattern: kiểm tra số lượng theo ngưỡng → hành động dọn dẹp</w:t>
+            </w:r>
+          </w:p>
+        </w:tc>
+        <w:tc>
+          <w:tcPr>
+            <w:tcW w:type="dxa" w:w="1211"/>
+            <w:tcBorders>
+              <w:top w:val="single" w:sz="4" w:space="0" w:color="CBCBCB"/>
+              <w:left w:val="single" w:sz="4" w:space="0" w:color="CBCBCB"/>
+              <w:bottom w:val="single" w:sz="4" w:space="0" w:color="CBCBCB"/>
+              <w:right w:val="single" w:sz="4" w:space="0" w:color="CBCBCB"/>
+            </w:tcBorders>
+          </w:tcPr>
+          <w:p>
+            <w:r>
+              <w:rPr>
+                <w:rFonts w:ascii="Courier New" w:hAnsi="Courier New"/>
+                <w:color w:val="F05922"/>
+                <w:sz w:val="20"/>
+              </w:rPr>
+              <w:t>Glob ".claude/plans/PLAN-*.md"</w:t>
+            </w:r>
+            <w:r>
+              <w:rPr>
+                <w:sz w:val="20"/>
+              </w:rPr>
+              <w:t xml:space="preserve"> ở Pre-0 sẽ trả nhiều file hơn theo thời gian. Task-planner phải đọc metadata của từng file để tìm plan liên quan. Nếu có 20+ plans, scan tốn ~10-20 dòng đọc thêm mỗi session. Không có gì ngăn plans Done tích lũy mãi</w:t>
+            </w:r>
+          </w:p>
+        </w:tc>
+        <w:tc>
+          <w:tcPr>
+            <w:tcW w:type="dxa" w:w="1211"/>
+            <w:tcBorders>
+              <w:top w:val="single" w:sz="4" w:space="0" w:color="CBCBCB"/>
+              <w:left w:val="single" w:sz="4" w:space="0" w:color="CBCBCB"/>
+              <w:bottom w:val="single" w:sz="4" w:space="0" w:color="CBCBCB"/>
+              <w:right w:val="single" w:sz="4" w:space="0" w:color="CBCBCB"/>
+            </w:tcBorders>
+          </w:tcPr>
+          <w:p>
+            <w:r>
+              <w:rPr>
+                <w:rFonts w:ascii="Courier New" w:hAnsi="Courier New"/>
+                <w:color w:val="F05922"/>
+                <w:sz w:val="20"/>
+              </w:rPr>
+              <w:t>CLAUDE.md §16</w:t>
+            </w:r>
+            <w:r>
+              <w:rPr>
+                <w:sz w:val="20"/>
+              </w:rPr>
+              <w:t xml:space="preserve"> (Quản lý Plan File) — thêm rule: "Khi </w:t>
+            </w:r>
+            <w:r>
+              <w:rPr>
+                <w:rFonts w:ascii="Courier New" w:hAnsi="Courier New"/>
+                <w:color w:val="F05922"/>
+                <w:sz w:val="20"/>
+              </w:rPr>
+              <w:t>.claude/plans/</w:t>
+            </w:r>
+            <w:r>
+              <w:rPr>
+                <w:sz w:val="20"/>
+              </w:rPr>
+              <w:t xml:space="preserve"> có ≥ 5 plan với </w:t>
+            </w:r>
+            <w:r>
+              <w:rPr>
+                <w:rFonts w:ascii="Courier New" w:hAnsi="Courier New"/>
+                <w:color w:val="F05922"/>
+                <w:sz w:val="20"/>
+              </w:rPr>
+              <w:t>status: done</w:t>
+            </w:r>
+            <w:r>
+              <w:rPr>
+                <w:sz w:val="20"/>
+              </w:rPr>
+              <w:t xml:space="preserve"> và </w:t>
+            </w:r>
+            <w:r>
+              <w:rPr>
+                <w:rFonts w:ascii="Courier New" w:hAnsi="Courier New"/>
+                <w:color w:val="F05922"/>
+                <w:sz w:val="20"/>
+              </w:rPr>
+              <w:t>updated</w:t>
+            </w:r>
+            <w:r>
+              <w:rPr>
+                <w:sz w:val="20"/>
+              </w:rPr>
+              <w:t xml:space="preserve"> cũ hơn 7 ngày → task-planner move chúng vào </w:t>
+            </w:r>
+            <w:r>
+              <w:rPr>
+                <w:rFonts w:ascii="Courier New" w:hAnsi="Courier New"/>
+                <w:color w:val="F05922"/>
+                <w:sz w:val="20"/>
+              </w:rPr>
+              <w:t>.claude/plans/archive/</w:t>
+            </w:r>
+            <w:r>
+              <w:rPr>
+                <w:sz w:val="20"/>
+              </w:rPr>
+              <w:t xml:space="preserve">". Và </w:t>
+            </w:r>
+            <w:r>
+              <w:rPr>
+                <w:rFonts w:ascii="Courier New" w:hAnsi="Courier New"/>
+                <w:color w:val="F05922"/>
+                <w:sz w:val="20"/>
+              </w:rPr>
+              <w:t>.claude/templates/PLAN-template.md</w:t>
+            </w:r>
+            <w:r>
+              <w:rPr>
+                <w:sz w:val="20"/>
+              </w:rPr>
+              <w:t xml:space="preserve"> — thêm ghi chú về lifecycle</w:t>
+            </w:r>
+          </w:p>
+        </w:tc>
+        <w:tc>
+          <w:tcPr>
+            <w:tcW w:type="dxa" w:w="1211"/>
+            <w:tcBorders>
+              <w:top w:val="single" w:sz="4" w:space="0" w:color="CBCBCB"/>
+              <w:left w:val="single" w:sz="4" w:space="0" w:color="CBCBCB"/>
+              <w:bottom w:val="single" w:sz="4" w:space="0" w:color="CBCBCB"/>
+              <w:right w:val="single" w:sz="4" w:space="0" w:color="CBCBCB"/>
+            </w:tcBorders>
+          </w:tcPr>
+          <w:p>
+            <w:r>
+              <w:rPr>
+                <w:sz w:val="20"/>
+              </w:rPr>
+              <w:t xml:space="preserve">Dispatcher Pre-0 chỉ Glob được 1-4 active plans thay vì 20+ tổng cộng. Thời gian plan lookup ổn định (không tăng theo số task đã xong). Sau 10+ tasks hoàn thành, số file ở </w:t>
+            </w:r>
+            <w:r>
+              <w:rPr>
+                <w:rFonts w:ascii="Courier New" w:hAnsi="Courier New"/>
+                <w:color w:val="F05922"/>
+                <w:sz w:val="20"/>
+              </w:rPr>
+              <w:t>.claude/plans/</w:t>
+            </w:r>
+            <w:r>
+              <w:rPr>
+                <w:sz w:val="20"/>
+              </w:rPr>
+              <w:t xml:space="preserve"> giữ ổn định ≤ 5 (active) thay vì tăng tuyến tính</w:t>
+            </w:r>
+          </w:p>
+        </w:tc>
+        <w:tc>
+          <w:tcPr>
+            <w:tcW w:type="dxa" w:w="1211"/>
+            <w:tcBorders>
+              <w:top w:val="single" w:sz="4" w:space="0" w:color="CBCBCB"/>
+              <w:left w:val="single" w:sz="4" w:space="0" w:color="CBCBCB"/>
+              <w:bottom w:val="single" w:sz="4" w:space="0" w:color="CBCBCB"/>
+              <w:right w:val="single" w:sz="4" w:space="0" w:color="CBCBCB"/>
+            </w:tcBorders>
+          </w:tcPr>
+          <w:p>
+            <w:r>
+              <w:rPr>
+                <w:sz w:val="20"/>
+              </w:rPr>
+              <w:t>Rủi ro: thấp-trung bình — cần định nghĩa "done" rõ ràng để không archive plan đang dùng. Effort: thấp — chỉ thêm 3-4 dòng rule vào CLAUDE.md §16 và ghi chú vào PLAN-template.md; không thay đổi code</w:t>
+            </w:r>
+          </w:p>
+        </w:tc>
+      </w:tr>
+      <w:tr>
+        <w:tc>
+          <w:tcPr>
+            <w:tcW w:type="dxa" w:w="1211"/>
+            <w:shd w:val="clear" w:color="auto" w:fill="B8B3D6"/>
+            <w:tcBorders>
+              <w:top w:val="single" w:sz="4" w:space="0" w:color="CBCBCB"/>
+              <w:left w:val="single" w:sz="4" w:space="0" w:color="CBCBCB"/>
+              <w:bottom w:val="single" w:sz="4" w:space="0" w:color="CBCBCB"/>
+              <w:right w:val="single" w:sz="4" w:space="0" w:color="CBCBCB"/>
+            </w:tcBorders>
+          </w:tcPr>
+          <w:p>
+            <w:r>
+              <w:rPr>
+                <w:sz w:val="20"/>
+              </w:rPr>
+              <w:t>E3</w:t>
+            </w:r>
+          </w:p>
+        </w:tc>
+        <w:tc>
+          <w:tcPr>
+            <w:tcW w:type="dxa" w:w="1211"/>
+            <w:shd w:val="clear" w:color="auto" w:fill="B8B3D6"/>
+            <w:tcBorders>
+              <w:top w:val="single" w:sz="4" w:space="0" w:color="CBCBCB"/>
+              <w:left w:val="single" w:sz="4" w:space="0" w:color="CBCBCB"/>
+              <w:bottom w:val="single" w:sz="4" w:space="0" w:color="CBCBCB"/>
+              <w:right w:val="single" w:sz="4" w:space="0" w:color="CBCBCB"/>
+            </w:tcBorders>
+          </w:tcPr>
+          <w:p>
+            <w:r>
+              <w:rPr>
+                <w:b/>
+                <w:sz w:val="20"/>
+              </w:rPr>
+              <w:t>Handoff Log pruning khi vượt ngưỡng</w:t>
+            </w:r>
+            <w:r>
+              <w:rPr>
+                <w:sz w:val="20"/>
+              </w:rPr>
+              <w:t xml:space="preserve"> — thêm rule giới hạn kích thước Handoff Log để tránh phình context window ở task nhiều bước</w:t>
+            </w:r>
+          </w:p>
+        </w:tc>
+        <w:tc>
+          <w:tcPr>
+            <w:tcW w:type="dxa" w:w="1211"/>
+            <w:shd w:val="clear" w:color="auto" w:fill="B8B3D6"/>
+            <w:tcBorders>
+              <w:top w:val="single" w:sz="4" w:space="0" w:color="CBCBCB"/>
+              <w:left w:val="single" w:sz="4" w:space="0" w:color="CBCBCB"/>
+              <w:bottom w:val="single" w:sz="4" w:space="0" w:color="CBCBCB"/>
+              <w:right w:val="single" w:sz="4" w:space="0" w:color="CBCBCB"/>
+            </w:tcBorders>
+          </w:tcPr>
+          <w:p>
+            <w:r>
+              <w:rPr>
+                <w:sz w:val="20"/>
+              </w:rPr>
+              <w:t>Handoff Log trong PLAN-*.md là append-only (CLAUDE.md §16.5: "KHÔNG xoá entry cũ"). Template không có giới hạn số entry. Trên task dài (10+ bước), Handoff Log có thể dài 500-1000 từ — toàn bộ được nhúng vào prompt của mỗi subagent mới, kể cả phần bước cũ không còn liên quan</w:t>
+            </w:r>
+          </w:p>
+        </w:tc>
+        <w:tc>
+          <w:tcPr>
+            <w:tcW w:type="dxa" w:w="1211"/>
+            <w:shd w:val="clear" w:color="auto" w:fill="B8B3D6"/>
+            <w:tcBorders>
+              <w:top w:val="single" w:sz="4" w:space="0" w:color="CBCBCB"/>
+              <w:left w:val="single" w:sz="4" w:space="0" w:color="CBCBCB"/>
+              <w:bottom w:val="single" w:sz="4" w:space="0" w:color="CBCBCB"/>
+              <w:right w:val="single" w:sz="4" w:space="0" w:color="CBCBCB"/>
+            </w:tcBorders>
+          </w:tcPr>
+          <w:p>
+            <w:r>
+              <w:rPr>
+                <w:rFonts w:ascii="Courier New" w:hAnsi="Courier New"/>
+                <w:color w:val="F05922"/>
+                <w:sz w:val="20"/>
+              </w:rPr>
+              <w:t>packages/server/src/memmachine_server/semantic_memory/semantic_ingestion.py</w:t>
+            </w:r>
+            <w:r>
+              <w:rPr>
+                <w:sz w:val="20"/>
+              </w:rPr>
+              <w:t xml:space="preserve"> — sau khi process episodes, </w:t>
+            </w:r>
+            <w:r>
+              <w:rPr>
+                <w:rFonts w:ascii="Courier New" w:hAnsi="Courier New"/>
+                <w:color w:val="F05922"/>
+                <w:sz w:val="20"/>
+              </w:rPr>
+              <w:t>_purge_ingested_episodes()</w:t>
+            </w:r>
+            <w:r>
+              <w:rPr>
+                <w:sz w:val="20"/>
+              </w:rPr>
+              <w:t xml:space="preserve"> xoá các row đã xử lý xong: "Purge các row đã ingest để tránh xử lý lại". Pattern: giữ chỉ dữ liệu "còn giá trị" thay vì giữ lại mãi mãi</w:t>
+            </w:r>
+          </w:p>
+        </w:tc>
+        <w:tc>
+          <w:tcPr>
+            <w:tcW w:type="dxa" w:w="1211"/>
+            <w:shd w:val="clear" w:color="auto" w:fill="B8B3D6"/>
+            <w:tcBorders>
+              <w:top w:val="single" w:sz="4" w:space="0" w:color="CBCBCB"/>
+              <w:left w:val="single" w:sz="4" w:space="0" w:color="CBCBCB"/>
+              <w:bottom w:val="single" w:sz="4" w:space="0" w:color="CBCBCB"/>
+              <w:right w:val="single" w:sz="4" w:space="0" w:color="CBCBCB"/>
+            </w:tcBorders>
+          </w:tcPr>
+          <w:p>
+            <w:r>
+              <w:rPr>
+                <w:sz w:val="20"/>
+              </w:rPr>
+              <w:t>Bước N+1 cần đọc Handoff Log để biết bối cảnh — nhưng thực tế chỉ cần biết 2-3 bước gần nhất và các "cảnh báo còn hiệu lực". Entries của bước 1-3 trong task 15 bước thường không còn liên quan đến bước 13-15. Nhúng toàn bộ vào prompt mỗi lần = token lãng phí</w:t>
+            </w:r>
+          </w:p>
+        </w:tc>
+        <w:tc>
+          <w:tcPr>
+            <w:tcW w:type="dxa" w:w="1211"/>
+            <w:shd w:val="clear" w:color="auto" w:fill="B8B3D6"/>
+            <w:tcBorders>
+              <w:top w:val="single" w:sz="4" w:space="0" w:color="CBCBCB"/>
+              <w:left w:val="single" w:sz="4" w:space="0" w:color="CBCBCB"/>
+              <w:bottom w:val="single" w:sz="4" w:space="0" w:color="CBCBCB"/>
+              <w:right w:val="single" w:sz="4" w:space="0" w:color="CBCBCB"/>
+            </w:tcBorders>
+          </w:tcPr>
+          <w:p>
+            <w:r>
+              <w:rPr>
+                <w:rFonts w:ascii="Courier New" w:hAnsi="Courier New"/>
+                <w:color w:val="F05922"/>
+                <w:sz w:val="20"/>
+              </w:rPr>
+              <w:t>CLAUDE.md §16.5 Bước 4</w:t>
+            </w:r>
+            <w:r>
+              <w:rPr>
+                <w:sz w:val="20"/>
+              </w:rPr>
+              <w:t xml:space="preserve"> và </w:t>
+            </w:r>
+            <w:r>
+              <w:rPr>
+                <w:rFonts w:ascii="Courier New" w:hAnsi="Courier New"/>
+                <w:color w:val="F05922"/>
+                <w:sz w:val="20"/>
+              </w:rPr>
+              <w:t>.claude/templates/PLAN-template.md</w:t>
+            </w:r>
+            <w:r>
+              <w:rPr>
+                <w:sz w:val="20"/>
+              </w:rPr>
+              <w:t xml:space="preserve"> — thêm rule: "Khi Handoff Log có &gt; 7 entries, task-planner tóm tắt các entry từ 1 đến (N-3) thành 1 block </w:t>
+            </w:r>
+            <w:r>
+              <w:rPr>
+                <w:rFonts w:ascii="Courier New" w:hAnsi="Courier New"/>
+                <w:color w:val="F05922"/>
+                <w:sz w:val="20"/>
+              </w:rPr>
+              <w:t>[ARCHIVED SUMMARY]</w:t>
+            </w:r>
+            <w:r>
+              <w:rPr>
+                <w:sz w:val="20"/>
+              </w:rPr>
+              <w:t xml:space="preserve"> ngắn (≤ 5 dòng), giữ nguyên 3 entry cuối đầy đủ chi tiết. Bước sau chỉ nhận 3 entries mới nhất + 1 summary khối cũ"</w:t>
+            </w:r>
+          </w:p>
+        </w:tc>
+        <w:tc>
+          <w:tcPr>
+            <w:tcW w:type="dxa" w:w="1211"/>
+            <w:shd w:val="clear" w:color="auto" w:fill="B8B3D6"/>
+            <w:tcBorders>
+              <w:top w:val="single" w:sz="4" w:space="0" w:color="CBCBCB"/>
+              <w:left w:val="single" w:sz="4" w:space="0" w:color="CBCBCB"/>
+              <w:bottom w:val="single" w:sz="4" w:space="0" w:color="CBCBCB"/>
+              <w:right w:val="single" w:sz="4" w:space="0" w:color="CBCBCB"/>
+            </w:tcBorders>
+          </w:tcPr>
+          <w:p>
+            <w:r>
+              <w:rPr>
+                <w:sz w:val="20"/>
+              </w:rPr>
+              <w:t>Prompt của subagent bước N không vượt quá ~300 từ Handoff Log bất kể task có bao nhiêu bước. Trên task 15 bước, giảm Handoff Log từ ~900 từ xuống ~350 từ (60% giảm) — trực tiếp giảm context window mỗi subagent dùng, giúp task dài không bị auto-compact giữa chừng</w:t>
+            </w:r>
+          </w:p>
+        </w:tc>
+        <w:tc>
+          <w:tcPr>
+            <w:tcW w:type="dxa" w:w="1211"/>
+            <w:shd w:val="clear" w:color="auto" w:fill="B8B3D6"/>
+            <w:tcBorders>
+              <w:top w:val="single" w:sz="4" w:space="0" w:color="CBCBCB"/>
+              <w:left w:val="single" w:sz="4" w:space="0" w:color="CBCBCB"/>
+              <w:bottom w:val="single" w:sz="4" w:space="0" w:color="CBCBCB"/>
+              <w:right w:val="single" w:sz="4" w:space="0" w:color="CBCBCB"/>
+            </w:tcBorders>
+          </w:tcPr>
+          <w:p>
+            <w:r>
+              <w:rPr>
+                <w:sz w:val="20"/>
+              </w:rPr>
+              <w:t>Rủi ro: trung bình — cần rule tóm tắt rõ ràng để không mất thông tin quan trọng. Nếu bước cũ có "gotcha" vẫn còn hiệu lực, summary có thể bỏ sót. Effort: thấp-trung — thêm rule vào CLAUDE.md §16.5 và PLAN-template.md; không cần thay đổi tool/code, chỉ quy trình</w:t>
+            </w:r>
+          </w:p>
+        </w:tc>
+      </w:tr>
+      <w:tr>
+        <w:tc>
+          <w:tcPr>
+            <w:tcW w:type="dxa" w:w="1211"/>
+            <w:tcBorders>
+              <w:top w:val="single" w:sz="4" w:space="0" w:color="CBCBCB"/>
+              <w:left w:val="single" w:sz="4" w:space="0" w:color="CBCBCB"/>
+              <w:bottom w:val="single" w:sz="4" w:space="0" w:color="CBCBCB"/>
+              <w:right w:val="single" w:sz="4" w:space="0" w:color="CBCBCB"/>
+            </w:tcBorders>
+          </w:tcPr>
+          <w:p>
+            <w:r>
+              <w:rPr>
+                <w:sz w:val="20"/>
+              </w:rPr>
+              <w:t>E4</w:t>
+            </w:r>
+          </w:p>
+        </w:tc>
+        <w:tc>
+          <w:tcPr>
+            <w:tcW w:type="dxa" w:w="1211"/>
+            <w:tcBorders>
+              <w:top w:val="single" w:sz="4" w:space="0" w:color="CBCBCB"/>
+              <w:left w:val="single" w:sz="4" w:space="0" w:color="CBCBCB"/>
+              <w:bottom w:val="single" w:sz="4" w:space="0" w:color="CBCBCB"/>
+              <w:right w:val="single" w:sz="4" w:space="0" w:color="CBCBCB"/>
+            </w:tcBorders>
+          </w:tcPr>
+          <w:p>
+            <w:r>
+              <w:rPr>
+                <w:b/>
+                <w:sz w:val="20"/>
+              </w:rPr>
+              <w:t>Exponential backoff timing cụ thể cho §9a Phase 3</w:t>
+            </w:r>
+            <w:r>
+              <w:rPr>
+                <w:sz w:val="20"/>
+              </w:rPr>
+              <w:t xml:space="preserve"> — thêm hướng dẫn chờ có thời gian cụ thể trước khi retry khi gặp lỗi thoáng qua</w:t>
+            </w:r>
+          </w:p>
+        </w:tc>
+        <w:tc>
+          <w:tcPr>
+            <w:tcW w:type="dxa" w:w="1211"/>
+            <w:tcBorders>
+              <w:top w:val="single" w:sz="4" w:space="0" w:color="CBCBCB"/>
+              <w:left w:val="single" w:sz="4" w:space="0" w:color="CBCBCB"/>
+              <w:bottom w:val="single" w:sz="4" w:space="0" w:color="CBCBCB"/>
+              <w:right w:val="single" w:sz="4" w:space="0" w:color="CBCBCB"/>
+            </w:tcBorders>
+          </w:tcPr>
+          <w:p>
+            <w:r>
+              <w:rPr>
+                <w:sz w:val="20"/>
+              </w:rPr>
+              <w:t>CLAUDE.md §9a Phase 3 "Contained Recovery" chỉ ghi "Thử 1 hành động nhỏ nhất có thể giải quyết vấn đề" — không có hướng dẫn chờ bao lâu hay tăng thời gian chờ theo số lần retry. Với lỗi thoáng qua (network timeout, file lock), retry ngay lập tức thường thất bại ngay lần 2 vì điều kiện chưa thay đổi</w:t>
+            </w:r>
+          </w:p>
+        </w:tc>
+        <w:tc>
+          <w:tcPr>
+            <w:tcW w:type="dxa" w:w="1211"/>
+            <w:tcBorders>
+              <w:top w:val="single" w:sz="4" w:space="0" w:color="CBCBCB"/>
+              <w:left w:val="single" w:sz="4" w:space="0" w:color="CBCBCB"/>
+              <w:bottom w:val="single" w:sz="4" w:space="0" w:color="CBCBCB"/>
+              <w:right w:val="single" w:sz="4" w:space="0" w:color="CBCBCB"/>
+            </w:tcBorders>
+          </w:tcPr>
+          <w:p>
+            <w:r>
+              <w:rPr>
+                <w:rFonts w:ascii="Courier New" w:hAnsi="Courier New"/>
+                <w:color w:val="F05922"/>
+                <w:sz w:val="20"/>
+              </w:rPr>
+              <w:t>packages/server/src/memmachine_server/semantic_memory/semantic_ingestion.py</w:t>
+            </w:r>
+            <w:r>
+              <w:rPr>
+                <w:sz w:val="20"/>
+              </w:rPr>
+              <w:t xml:space="preserve">: </w:t>
+            </w:r>
+            <w:r>
+              <w:rPr>
+                <w:rFonts w:ascii="Courier New" w:hAnsi="Courier New"/>
+                <w:color w:val="F05922"/>
+                <w:sz w:val="20"/>
+              </w:rPr>
+              <w:t>except Exception: backoff_sec = min(backoff_sec * 2, 60.0); await asyncio.sleep(backoff_sec)</w:t>
+            </w:r>
+            <w:r>
+              <w:rPr>
+                <w:sz w:val="20"/>
+              </w:rPr>
+              <w:t xml:space="preserve"> — khởi đầu từ 2 giây, mỗi lỗi nhân đôi (2→4→8→16→32→60), trần 60 giây. Tránh hammering external service khi có sự cố thoáng qua</w:t>
+            </w:r>
+          </w:p>
+        </w:tc>
+        <w:tc>
+          <w:tcPr>
+            <w:tcW w:type="dxa" w:w="1211"/>
+            <w:tcBorders>
+              <w:top w:val="single" w:sz="4" w:space="0" w:color="CBCBCB"/>
+              <w:left w:val="single" w:sz="4" w:space="0" w:color="CBCBCB"/>
+              <w:bottom w:val="single" w:sz="4" w:space="0" w:color="CBCBCB"/>
+              <w:right w:val="single" w:sz="4" w:space="0" w:color="CBCBCB"/>
+            </w:tcBorders>
+          </w:tcPr>
+          <w:p>
+            <w:r>
+              <w:rPr>
+                <w:sz w:val="20"/>
+              </w:rPr>
+              <w:t>§9a hiện không phân biệt lỗi cấu trúc (sai path, thiếu dependency — không ích gì khi chờ) với lỗi thoáng qua (network timeout, process lock, rate limit — chờ rồi retry có thể giải quyết). Thiếu guidance này khiến agent hoặc retry quá nhanh (lãng phí turn) hoặc dừng hẳn khi nên chờ</w:t>
+            </w:r>
+          </w:p>
+        </w:tc>
+        <w:tc>
+          <w:tcPr>
+            <w:tcW w:type="dxa" w:w="1211"/>
+            <w:tcBorders>
+              <w:top w:val="single" w:sz="4" w:space="0" w:color="CBCBCB"/>
+              <w:left w:val="single" w:sz="4" w:space="0" w:color="CBCBCB"/>
+              <w:bottom w:val="single" w:sz="4" w:space="0" w:color="CBCBCB"/>
+              <w:right w:val="single" w:sz="4" w:space="0" w:color="CBCBCB"/>
+            </w:tcBorders>
+          </w:tcPr>
+          <w:p>
+            <w:r>
+              <w:rPr>
+                <w:rFonts w:ascii="Courier New" w:hAnsi="Courier New"/>
+                <w:color w:val="F05922"/>
+                <w:sz w:val="20"/>
+              </w:rPr>
+              <w:t>CLAUDE.md §9a Phase 2 — Diagnose</w:t>
+            </w:r>
+            <w:r>
+              <w:rPr>
+                <w:sz w:val="20"/>
+              </w:rPr>
+              <w:t xml:space="preserve"> và </w:t>
+            </w:r>
+            <w:r>
+              <w:rPr>
+                <w:rFonts w:ascii="Courier New" w:hAnsi="Courier New"/>
+                <w:color w:val="F05922"/>
+                <w:sz w:val="20"/>
+              </w:rPr>
+              <w:t>Phase 3 — Contained Recovery</w:t>
+            </w:r>
+            <w:r>
+              <w:rPr>
+                <w:sz w:val="20"/>
+              </w:rPr>
+              <w:t xml:space="preserve"> — bổ sung: (a) Phase 2 thêm phân loại lỗi: "transient" (network/timeout/lock/rate-limit → chờ có thể giúp) vs "structural" (path sai/thiếu dependency → chờ không giúp); (b) Phase 3 thêm: "Với lỗi transient: chờ N giây trước khi thử (N = 2 × số lần đã retry, trần 30 giây) — KHÔNG retry ngay lập tức"</w:t>
+            </w:r>
+          </w:p>
+        </w:tc>
+        <w:tc>
+          <w:tcPr>
+            <w:tcW w:type="dxa" w:w="1211"/>
+            <w:tcBorders>
+              <w:top w:val="single" w:sz="4" w:space="0" w:color="CBCBCB"/>
+              <w:left w:val="single" w:sz="4" w:space="0" w:color="CBCBCB"/>
+              <w:bottom w:val="single" w:sz="4" w:space="0" w:color="CBCBCB"/>
+              <w:right w:val="single" w:sz="4" w:space="0" w:color="CBCBCB"/>
+            </w:tcBorders>
+          </w:tcPr>
+          <w:p>
+            <w:r>
+              <w:rPr>
+                <w:sz w:val="20"/>
+              </w:rPr>
+              <w:t>Khi gặp rate-limit hoặc network timeout, agent chờ 2 giây trước lần thử đầu, 4 giây nếu vẫn fail — thay vì retry 3 lần liên tiếp ngay. Trong thực tế, lỗi thoáng qua thường giải quyết sau 2-8 giây; agent tiết kiệm 1-2 turn failed so với retry-ngay. Ngược lại, lỗi cấu trúc → không chờ, báo Phase 4 ngay (không lãng phí 30 giây wait vô ích)</w:t>
+            </w:r>
+          </w:p>
+        </w:tc>
+        <w:tc>
+          <w:tcPr>
+            <w:tcW w:type="dxa" w:w="1211"/>
+            <w:tcBorders>
+              <w:top w:val="single" w:sz="4" w:space="0" w:color="CBCBCB"/>
+              <w:left w:val="single" w:sz="4" w:space="0" w:color="CBCBCB"/>
+              <w:bottom w:val="single" w:sz="4" w:space="0" w:color="CBCBCB"/>
+              <w:right w:val="single" w:sz="4" w:space="0" w:color="CBCBCB"/>
+            </w:tcBorders>
+          </w:tcPr>
+          <w:p>
+            <w:r>
+              <w:rPr>
+                <w:sz w:val="20"/>
+              </w:rPr>
+              <w:t>Rủi ro: rất thấp — chỉ thêm hướng dẫn timing vào văn bản CLAUDE.md, không thay đổi logic bắt buộc nào. Effort: rất thấp — thêm ~4-5 dòng vào §9a Phase 2 và Phase 3</w:t>
+            </w:r>
+          </w:p>
+        </w:tc>
+      </w:tr>
+    </w:tbl>
+    <w:p/>
+    <w:p>
+      <w:pPr>
+        <w:pBdr>
+          <w:bottom w:val="single" w:sz="6" w:space="1" w:color="F05922"/>
+        </w:pBdr>
+        <w:spacing w:after="120"/>
+      </w:pPr>
+    </w:p>
+    <w:p>
+      <w:pPr>
+        <w:pStyle w:val="Heading2"/>
+        <w:spacing w:before="200" w:after="80"/>
+      </w:pPr>
+      <w:r>
+        <w:rPr>
+          <w:color w:val="F05922"/>
+          <w:sz w:val="28"/>
+        </w:rPr>
+        <w:t>9. Trạng thái áp dụng đề xuất</w:t>
       </w:r>
     </w:p>
     <w:p>
@@ -4078,7 +5526,7 @@
           <w:i/>
           <w:sz w:val="21"/>
         </w:rPr>
-        <w:t>(Sẽ điền sau khi Phase 2 — đề xuất — hoàn thành và user xác nhận)</w:t>
+        <w:t>(Điền sau khi user xác nhận ở Bước 2.2)</w:t>
       </w:r>
     </w:p>
     <w:tbl>
@@ -4236,7 +5684,7 @@
               <w:rPr>
                 <w:sz w:val="20"/>
               </w:rPr>
-              <w:t>-</w:t>
+              <w:t>E1</w:t>
             </w:r>
           </w:p>
         </w:tc>
@@ -4256,7 +5704,7 @@
               <w:rPr>
                 <w:sz w:val="20"/>
               </w:rPr>
-              <w:t>-</w:t>
+              <w:t>Category tagging cho GOTCHAS.md</w:t>
             </w:r>
           </w:p>
         </w:tc>
@@ -4276,7 +5724,187 @@
               <w:rPr>
                 <w:sz w:val="20"/>
               </w:rPr>
-              <w:t>Chờ Phase 2</w:t>
+              <w:t>Chờ user xác nhận</w:t>
+            </w:r>
+          </w:p>
+        </w:tc>
+      </w:tr>
+      <w:tr>
+        <w:tc>
+          <w:tcPr>
+            <w:tcW w:type="dxa" w:w="3230"/>
+            <w:tcBorders>
+              <w:top w:val="single" w:sz="4" w:space="0" w:color="CBCBCB"/>
+              <w:left w:val="single" w:sz="4" w:space="0" w:color="CBCBCB"/>
+              <w:bottom w:val="single" w:sz="4" w:space="0" w:color="CBCBCB"/>
+              <w:right w:val="single" w:sz="4" w:space="0" w:color="CBCBCB"/>
+            </w:tcBorders>
+          </w:tcPr>
+          <w:p>
+            <w:r>
+              <w:rPr>
+                <w:sz w:val="20"/>
+              </w:rPr>
+              <w:t>E2</w:t>
+            </w:r>
+          </w:p>
+        </w:tc>
+        <w:tc>
+          <w:tcPr>
+            <w:tcW w:type="dxa" w:w="3230"/>
+            <w:tcBorders>
+              <w:top w:val="single" w:sz="4" w:space="0" w:color="CBCBCB"/>
+              <w:left w:val="single" w:sz="4" w:space="0" w:color="CBCBCB"/>
+              <w:bottom w:val="single" w:sz="4" w:space="0" w:color="CBCBCB"/>
+              <w:right w:val="single" w:sz="4" w:space="0" w:color="CBCBCB"/>
+            </w:tcBorders>
+          </w:tcPr>
+          <w:p>
+            <w:r>
+              <w:rPr>
+                <w:sz w:val="20"/>
+              </w:rPr>
+              <w:t>Threshold rule cho plan files cũ</w:t>
+            </w:r>
+          </w:p>
+        </w:tc>
+        <w:tc>
+          <w:tcPr>
+            <w:tcW w:type="dxa" w:w="3230"/>
+            <w:tcBorders>
+              <w:top w:val="single" w:sz="4" w:space="0" w:color="CBCBCB"/>
+              <w:left w:val="single" w:sz="4" w:space="0" w:color="CBCBCB"/>
+              <w:bottom w:val="single" w:sz="4" w:space="0" w:color="CBCBCB"/>
+              <w:right w:val="single" w:sz="4" w:space="0" w:color="CBCBCB"/>
+            </w:tcBorders>
+          </w:tcPr>
+          <w:p>
+            <w:r>
+              <w:rPr>
+                <w:sz w:val="20"/>
+              </w:rPr>
+              <w:t>Chờ user xác nhận</w:t>
+            </w:r>
+          </w:p>
+        </w:tc>
+      </w:tr>
+      <w:tr>
+        <w:tc>
+          <w:tcPr>
+            <w:tcW w:type="dxa" w:w="3230"/>
+            <w:shd w:val="clear" w:color="auto" w:fill="B8B3D6"/>
+            <w:tcBorders>
+              <w:top w:val="single" w:sz="4" w:space="0" w:color="CBCBCB"/>
+              <w:left w:val="single" w:sz="4" w:space="0" w:color="CBCBCB"/>
+              <w:bottom w:val="single" w:sz="4" w:space="0" w:color="CBCBCB"/>
+              <w:right w:val="single" w:sz="4" w:space="0" w:color="CBCBCB"/>
+            </w:tcBorders>
+          </w:tcPr>
+          <w:p>
+            <w:r>
+              <w:rPr>
+                <w:sz w:val="20"/>
+              </w:rPr>
+              <w:t>E3</w:t>
+            </w:r>
+          </w:p>
+        </w:tc>
+        <w:tc>
+          <w:tcPr>
+            <w:tcW w:type="dxa" w:w="3230"/>
+            <w:shd w:val="clear" w:color="auto" w:fill="B8B3D6"/>
+            <w:tcBorders>
+              <w:top w:val="single" w:sz="4" w:space="0" w:color="CBCBCB"/>
+              <w:left w:val="single" w:sz="4" w:space="0" w:color="CBCBCB"/>
+              <w:bottom w:val="single" w:sz="4" w:space="0" w:color="CBCBCB"/>
+              <w:right w:val="single" w:sz="4" w:space="0" w:color="CBCBCB"/>
+            </w:tcBorders>
+          </w:tcPr>
+          <w:p>
+            <w:r>
+              <w:rPr>
+                <w:sz w:val="20"/>
+              </w:rPr>
+              <w:t>Handoff Log pruning khi vượt ngưỡng</w:t>
+            </w:r>
+          </w:p>
+        </w:tc>
+        <w:tc>
+          <w:tcPr>
+            <w:tcW w:type="dxa" w:w="3230"/>
+            <w:shd w:val="clear" w:color="auto" w:fill="B8B3D6"/>
+            <w:tcBorders>
+              <w:top w:val="single" w:sz="4" w:space="0" w:color="CBCBCB"/>
+              <w:left w:val="single" w:sz="4" w:space="0" w:color="CBCBCB"/>
+              <w:bottom w:val="single" w:sz="4" w:space="0" w:color="CBCBCB"/>
+              <w:right w:val="single" w:sz="4" w:space="0" w:color="CBCBCB"/>
+            </w:tcBorders>
+          </w:tcPr>
+          <w:p>
+            <w:r>
+              <w:rPr>
+                <w:sz w:val="20"/>
+              </w:rPr>
+              <w:t>Chờ user xác nhận</w:t>
+            </w:r>
+          </w:p>
+        </w:tc>
+      </w:tr>
+      <w:tr>
+        <w:tc>
+          <w:tcPr>
+            <w:tcW w:type="dxa" w:w="3230"/>
+            <w:tcBorders>
+              <w:top w:val="single" w:sz="4" w:space="0" w:color="CBCBCB"/>
+              <w:left w:val="single" w:sz="4" w:space="0" w:color="CBCBCB"/>
+              <w:bottom w:val="single" w:sz="4" w:space="0" w:color="CBCBCB"/>
+              <w:right w:val="single" w:sz="4" w:space="0" w:color="CBCBCB"/>
+            </w:tcBorders>
+          </w:tcPr>
+          <w:p>
+            <w:r>
+              <w:rPr>
+                <w:sz w:val="20"/>
+              </w:rPr>
+              <w:t>E4</w:t>
+            </w:r>
+          </w:p>
+        </w:tc>
+        <w:tc>
+          <w:tcPr>
+            <w:tcW w:type="dxa" w:w="3230"/>
+            <w:tcBorders>
+              <w:top w:val="single" w:sz="4" w:space="0" w:color="CBCBCB"/>
+              <w:left w:val="single" w:sz="4" w:space="0" w:color="CBCBCB"/>
+              <w:bottom w:val="single" w:sz="4" w:space="0" w:color="CBCBCB"/>
+              <w:right w:val="single" w:sz="4" w:space="0" w:color="CBCBCB"/>
+            </w:tcBorders>
+          </w:tcPr>
+          <w:p>
+            <w:r>
+              <w:rPr>
+                <w:sz w:val="20"/>
+              </w:rPr>
+              <w:t>Exponential backoff timing cụ thể cho §9a Phase 3</w:t>
+            </w:r>
+          </w:p>
+        </w:tc>
+        <w:tc>
+          <w:tcPr>
+            <w:tcW w:type="dxa" w:w="3230"/>
+            <w:tcBorders>
+              <w:top w:val="single" w:sz="4" w:space="0" w:color="CBCBCB"/>
+              <w:left w:val="single" w:sz="4" w:space="0" w:color="CBCBCB"/>
+              <w:bottom w:val="single" w:sz="4" w:space="0" w:color="CBCBCB"/>
+              <w:right w:val="single" w:sz="4" w:space="0" w:color="CBCBCB"/>
+            </w:tcBorders>
+          </w:tcPr>
+          <w:p>
+            <w:r>
+              <w:rPr>
+                <w:sz w:val="20"/>
+              </w:rPr>
+              <w:t>Chờ user xác nhận</w:t>
             </w:r>
           </w:p>
         </w:tc>

</xml_diff>